<commit_message>
Realizado a primeira atividade da semana 3
</commit_message>
<xml_diff>
--- a/Semana03_Hyperautomation/Semana03_GitFlow_Mapeamento.docx
+++ b/Semana03_Hyperautomation/Semana03_GitFlow_Mapeamento.docx
@@ -5,6 +5,7 @@
     <w:p>
       <w:pPr>
         <w:spacing w:line="360" w:lineRule="auto"/>
+        <w:jc w:val="center"/>
         <w:rPr>
           <w:rFonts w:ascii="Arial" w:hAnsi="Arial" w:cs="Arial"/>
         </w:rPr>
@@ -1129,7 +1130,7 @@
         <w:rPr>
           <w:rFonts w:ascii="Arial" w:hAnsi="Arial" w:cs="Arial"/>
         </w:rPr>
-        <w:t xml:space="preserve"> conectam os elementos para mostrar a ordem lógica do </w:t>
+        <w:t xml:space="preserve"> devem conectar os elementos respeitando a lógica do </w:t>
       </w:r>
       <w:proofErr w:type="spellStart"/>
       <w:r>
@@ -1143,36 +1144,300 @@
         <w:rPr>
           <w:rFonts w:ascii="Arial" w:hAnsi="Arial" w:cs="Arial"/>
         </w:rPr>
-        <w:t xml:space="preserve">. O processo começa no Evento Inicial, passa pelas tarefas de configuração do Líder e chega ao Gateway Paralelo, que ramifica o fluxo para as raias de cada desenvolvedor. Após cada desenvolvedor abrir seu </w:t>
+        <w:t>:</w:t>
+      </w:r>
+    </w:p>
+    <w:p>
+      <w:pPr>
+        <w:numPr>
+          <w:ilvl w:val="0"/>
+          <w:numId w:val="5"/>
+        </w:numPr>
+        <w:spacing w:line="360" w:lineRule="auto"/>
+        <w:jc w:val="both"/>
+        <w:rPr>
+          <w:rFonts w:ascii="Arial" w:hAnsi="Arial" w:cs="Arial"/>
+        </w:rPr>
+      </w:pPr>
+      <w:r>
+        <w:rPr>
+          <w:rFonts w:ascii="Arial" w:hAnsi="Arial" w:cs="Arial"/>
+        </w:rPr>
+        <w:t>Uma seta conecta o </w:t>
+      </w:r>
+      <w:r>
+        <w:rPr>
+          <w:rFonts w:ascii="Arial" w:hAnsi="Arial" w:cs="Arial"/>
+          <w:b/>
+          <w:bCs/>
+        </w:rPr>
+        <w:t>Evento Inicial</w:t>
+      </w:r>
+      <w:r>
+        <w:rPr>
+          <w:rFonts w:ascii="Arial" w:hAnsi="Arial" w:cs="Arial"/>
+        </w:rPr>
+        <w:t> às tarefas de configuração do </w:t>
+      </w:r>
+      <w:r>
+        <w:rPr>
+          <w:rFonts w:ascii="Arial" w:hAnsi="Arial" w:cs="Arial"/>
+          <w:b/>
+          <w:bCs/>
+        </w:rPr>
+        <w:t>Líder Técnico</w:t>
+      </w:r>
+      <w:r>
+        <w:rPr>
+          <w:rFonts w:ascii="Arial" w:hAnsi="Arial" w:cs="Arial"/>
+        </w:rPr>
+        <w:t>.</w:t>
+      </w:r>
+    </w:p>
+    <w:p>
+      <w:pPr>
+        <w:numPr>
+          <w:ilvl w:val="0"/>
+          <w:numId w:val="5"/>
+        </w:numPr>
+        <w:spacing w:line="360" w:lineRule="auto"/>
+        <w:jc w:val="both"/>
+        <w:rPr>
+          <w:rFonts w:ascii="Arial" w:hAnsi="Arial" w:cs="Arial"/>
+        </w:rPr>
+      </w:pPr>
+      <w:r>
+        <w:rPr>
+          <w:rFonts w:ascii="Arial" w:hAnsi="Arial" w:cs="Arial"/>
+        </w:rPr>
+        <w:t>Após o compartilhamento do link, o fluxo conecta-se ao </w:t>
+      </w:r>
+      <w:r>
+        <w:rPr>
+          <w:rFonts w:ascii="Arial" w:hAnsi="Arial" w:cs="Arial"/>
+          <w:b/>
+          <w:bCs/>
+        </w:rPr>
+        <w:t>Gateway Paralelo de Divisão</w:t>
+      </w:r>
+      <w:r>
+        <w:rPr>
+          <w:rFonts w:ascii="Arial" w:hAnsi="Arial" w:cs="Arial"/>
+        </w:rPr>
+        <w:t>, que ramifica setas para cada uma das raias dos </w:t>
+      </w:r>
+      <w:r>
+        <w:rPr>
+          <w:rFonts w:ascii="Arial" w:hAnsi="Arial" w:cs="Arial"/>
+          <w:b/>
+          <w:bCs/>
+        </w:rPr>
+        <w:t>Desenvolvedores</w:t>
+      </w:r>
+      <w:r>
+        <w:rPr>
+          <w:rFonts w:ascii="Arial" w:hAnsi="Arial" w:cs="Arial"/>
+        </w:rPr>
+        <w:t>.</w:t>
+      </w:r>
+    </w:p>
+    <w:p>
+      <w:pPr>
+        <w:numPr>
+          <w:ilvl w:val="0"/>
+          <w:numId w:val="5"/>
+        </w:numPr>
+        <w:spacing w:line="360" w:lineRule="auto"/>
+        <w:jc w:val="both"/>
+        <w:rPr>
+          <w:rFonts w:ascii="Arial" w:hAnsi="Arial" w:cs="Arial"/>
+        </w:rPr>
+      </w:pPr>
+      <w:r>
+        <w:rPr>
+          <w:rFonts w:ascii="Arial" w:hAnsi="Arial" w:cs="Arial"/>
+        </w:rPr>
+        <w:t xml:space="preserve">Dentro de cada raia, as tarefas de desenvolvimento seguem uma sequência linear (Clonar -&gt; Criar Branch -&gt; Desenvolver -&gt; </w:t>
       </w:r>
       <w:proofErr w:type="spellStart"/>
       <w:r>
         <w:rPr>
           <w:rFonts w:ascii="Arial" w:hAnsi="Arial" w:cs="Arial"/>
         </w:rPr>
-        <w:t>Pull</w:t>
+        <w:t>Commit</w:t>
       </w:r>
       <w:proofErr w:type="spellEnd"/>
       <w:r>
         <w:rPr>
           <w:rFonts w:ascii="Arial" w:hAnsi="Arial" w:cs="Arial"/>
         </w:rPr>
-        <w:t xml:space="preserve"> </w:t>
+        <w:t xml:space="preserve"> -&gt; </w:t>
       </w:r>
       <w:proofErr w:type="spellStart"/>
       <w:r>
         <w:rPr>
           <w:rFonts w:ascii="Arial" w:hAnsi="Arial" w:cs="Arial"/>
         </w:rPr>
-        <w:t>Request</w:t>
+        <w:t>Push</w:t>
       </w:r>
       <w:proofErr w:type="spellEnd"/>
       <w:r>
         <w:rPr>
           <w:rFonts w:ascii="Arial" w:hAnsi="Arial" w:cs="Arial"/>
         </w:rPr>
-        <w:t>, as setas convergem para um novo Gateway Paralelo de sincronização que leva às tarefas de revisão do Líder. O fluxo então passa pelo Gateway Exclusivo: se aprovado, conecta-se ao merge final e ao Evento Final; se reprovado, as setas retornam às tarefas de ajuste dos desenvolvedores, criando um ciclo de repetição até a aprovação.</w:t>
-      </w:r>
+        <w:t xml:space="preserve"> -&gt; Abrir PR).</w:t>
+      </w:r>
+    </w:p>
+    <w:p>
+      <w:pPr>
+        <w:numPr>
+          <w:ilvl w:val="0"/>
+          <w:numId w:val="5"/>
+        </w:numPr>
+        <w:spacing w:line="360" w:lineRule="auto"/>
+        <w:jc w:val="both"/>
+        <w:rPr>
+          <w:rFonts w:ascii="Arial" w:hAnsi="Arial" w:cs="Arial"/>
+        </w:rPr>
+      </w:pPr>
+      <w:r>
+        <w:rPr>
+          <w:rFonts w:ascii="Arial" w:hAnsi="Arial" w:cs="Arial"/>
+        </w:rPr>
+        <w:t>As setas de saída de cada "Abrir PR" convergem para o </w:t>
+      </w:r>
+      <w:r>
+        <w:rPr>
+          <w:rFonts w:ascii="Arial" w:hAnsi="Arial" w:cs="Arial"/>
+          <w:b/>
+          <w:bCs/>
+        </w:rPr>
+        <w:t>Gateway Paralelo de Junção</w:t>
+      </w:r>
+      <w:r>
+        <w:rPr>
+          <w:rFonts w:ascii="Arial" w:hAnsi="Arial" w:cs="Arial"/>
+        </w:rPr>
+        <w:t>.</w:t>
+      </w:r>
+    </w:p>
+    <w:p>
+      <w:pPr>
+        <w:numPr>
+          <w:ilvl w:val="0"/>
+          <w:numId w:val="5"/>
+        </w:numPr>
+        <w:spacing w:line="360" w:lineRule="auto"/>
+        <w:jc w:val="both"/>
+        <w:rPr>
+          <w:rFonts w:ascii="Arial" w:hAnsi="Arial" w:cs="Arial"/>
+        </w:rPr>
+      </w:pPr>
+      <w:r>
+        <w:rPr>
+          <w:rFonts w:ascii="Arial" w:hAnsi="Arial" w:cs="Arial"/>
+        </w:rPr>
+        <w:t>O fluxo segue para as tarefas de revisão e teste do </w:t>
+      </w:r>
+      <w:r>
+        <w:rPr>
+          <w:rFonts w:ascii="Arial" w:hAnsi="Arial" w:cs="Arial"/>
+          <w:b/>
+          <w:bCs/>
+        </w:rPr>
+        <w:t>Líder Técnico</w:t>
+      </w:r>
+      <w:r>
+        <w:rPr>
+          <w:rFonts w:ascii="Arial" w:hAnsi="Arial" w:cs="Arial"/>
+        </w:rPr>
+        <w:t>, culminando no </w:t>
+      </w:r>
+      <w:r>
+        <w:rPr>
+          <w:rFonts w:ascii="Arial" w:hAnsi="Arial" w:cs="Arial"/>
+          <w:b/>
+          <w:bCs/>
+        </w:rPr>
+        <w:t>Gateway Exclusivo</w:t>
+      </w:r>
+      <w:r>
+        <w:rPr>
+          <w:rFonts w:ascii="Arial" w:hAnsi="Arial" w:cs="Arial"/>
+        </w:rPr>
+        <w:t>.</w:t>
+      </w:r>
+    </w:p>
+    <w:p>
+      <w:pPr>
+        <w:numPr>
+          <w:ilvl w:val="0"/>
+          <w:numId w:val="5"/>
+        </w:numPr>
+        <w:spacing w:line="360" w:lineRule="auto"/>
+        <w:jc w:val="both"/>
+        <w:rPr>
+          <w:rFonts w:ascii="Arial" w:hAnsi="Arial" w:cs="Arial"/>
+        </w:rPr>
+      </w:pPr>
+      <w:r>
+        <w:rPr>
+          <w:rFonts w:ascii="Arial" w:hAnsi="Arial" w:cs="Arial"/>
+        </w:rPr>
+        <w:lastRenderedPageBreak/>
+        <w:t>As saídas do Gateway Exclusivo conectam-se ou ao merge final (</w:t>
+      </w:r>
+      <w:r>
+        <w:rPr>
+          <w:rFonts w:ascii="Arial" w:hAnsi="Arial" w:cs="Arial"/>
+          <w:b/>
+          <w:bCs/>
+        </w:rPr>
+        <w:t>SIM</w:t>
+      </w:r>
+      <w:r>
+        <w:rPr>
+          <w:rFonts w:ascii="Arial" w:hAnsi="Arial" w:cs="Arial"/>
+        </w:rPr>
+        <w:t>) ou retornam às tarefas de ajuste dos desenvolvedores (</w:t>
+      </w:r>
+      <w:r>
+        <w:rPr>
+          <w:rFonts w:ascii="Arial" w:hAnsi="Arial" w:cs="Arial"/>
+          <w:b/>
+          <w:bCs/>
+        </w:rPr>
+        <w:t>NÃO</w:t>
+      </w:r>
+      <w:r>
+        <w:rPr>
+          <w:rFonts w:ascii="Arial" w:hAnsi="Arial" w:cs="Arial"/>
+        </w:rPr>
+        <w:t>), garantindo a continuidade do processo até o </w:t>
+      </w:r>
+      <w:r>
+        <w:rPr>
+          <w:rFonts w:ascii="Arial" w:hAnsi="Arial" w:cs="Arial"/>
+          <w:b/>
+          <w:bCs/>
+        </w:rPr>
+        <w:t>Evento Final</w:t>
+      </w:r>
+      <w:r>
+        <w:rPr>
+          <w:rFonts w:ascii="Arial" w:hAnsi="Arial" w:cs="Arial"/>
+        </w:rPr>
+        <w:t>.</w:t>
+      </w:r>
+    </w:p>
+    <w:p>
+      <w:pPr>
+        <w:spacing w:line="360" w:lineRule="auto"/>
+        <w:jc w:val="both"/>
+        <w:rPr>
+          <w:rFonts w:ascii="Arial" w:hAnsi="Arial" w:cs="Arial"/>
+        </w:rPr>
+      </w:pPr>
     </w:p>
     <w:sectPr>
       <w:pgSz w:w="11906" w:h="16838"/>
@@ -1336,6 +1601,119 @@
     </w:lvl>
   </w:abstractNum>
   <w:abstractNum w:abstractNumId="1" w15:restartNumberingAfterBreak="0">
+    <w:nsid w:val="45C97758"/>
+    <w:multiLevelType w:val="multilevel"/>
+    <w:tmpl w:val="7EC0032C"/>
+    <w:lvl w:ilvl="0">
+      <w:start w:val="1"/>
+      <w:numFmt w:val="decimal"/>
+      <w:lvlText w:val="%1."/>
+      <w:lvlJc w:val="left"/>
+      <w:pPr>
+        <w:tabs>
+          <w:tab w:val="num" w:pos="720"/>
+        </w:tabs>
+        <w:ind w:left="720" w:hanging="360"/>
+      </w:pPr>
+    </w:lvl>
+    <w:lvl w:ilvl="1" w:tentative="1">
+      <w:start w:val="1"/>
+      <w:numFmt w:val="decimal"/>
+      <w:lvlText w:val="%2."/>
+      <w:lvlJc w:val="left"/>
+      <w:pPr>
+        <w:tabs>
+          <w:tab w:val="num" w:pos="1440"/>
+        </w:tabs>
+        <w:ind w:left="1440" w:hanging="360"/>
+      </w:pPr>
+    </w:lvl>
+    <w:lvl w:ilvl="2" w:tentative="1">
+      <w:start w:val="1"/>
+      <w:numFmt w:val="decimal"/>
+      <w:lvlText w:val="%3."/>
+      <w:lvlJc w:val="left"/>
+      <w:pPr>
+        <w:tabs>
+          <w:tab w:val="num" w:pos="2160"/>
+        </w:tabs>
+        <w:ind w:left="2160" w:hanging="360"/>
+      </w:pPr>
+    </w:lvl>
+    <w:lvl w:ilvl="3" w:tentative="1">
+      <w:start w:val="1"/>
+      <w:numFmt w:val="decimal"/>
+      <w:lvlText w:val="%4."/>
+      <w:lvlJc w:val="left"/>
+      <w:pPr>
+        <w:tabs>
+          <w:tab w:val="num" w:pos="2880"/>
+        </w:tabs>
+        <w:ind w:left="2880" w:hanging="360"/>
+      </w:pPr>
+    </w:lvl>
+    <w:lvl w:ilvl="4" w:tentative="1">
+      <w:start w:val="1"/>
+      <w:numFmt w:val="decimal"/>
+      <w:lvlText w:val="%5."/>
+      <w:lvlJc w:val="left"/>
+      <w:pPr>
+        <w:tabs>
+          <w:tab w:val="num" w:pos="3600"/>
+        </w:tabs>
+        <w:ind w:left="3600" w:hanging="360"/>
+      </w:pPr>
+    </w:lvl>
+    <w:lvl w:ilvl="5" w:tentative="1">
+      <w:start w:val="1"/>
+      <w:numFmt w:val="decimal"/>
+      <w:lvlText w:val="%6."/>
+      <w:lvlJc w:val="left"/>
+      <w:pPr>
+        <w:tabs>
+          <w:tab w:val="num" w:pos="4320"/>
+        </w:tabs>
+        <w:ind w:left="4320" w:hanging="360"/>
+      </w:pPr>
+    </w:lvl>
+    <w:lvl w:ilvl="6" w:tentative="1">
+      <w:start w:val="1"/>
+      <w:numFmt w:val="decimal"/>
+      <w:lvlText w:val="%7."/>
+      <w:lvlJc w:val="left"/>
+      <w:pPr>
+        <w:tabs>
+          <w:tab w:val="num" w:pos="5040"/>
+        </w:tabs>
+        <w:ind w:left="5040" w:hanging="360"/>
+      </w:pPr>
+    </w:lvl>
+    <w:lvl w:ilvl="7" w:tentative="1">
+      <w:start w:val="1"/>
+      <w:numFmt w:val="decimal"/>
+      <w:lvlText w:val="%8."/>
+      <w:lvlJc w:val="left"/>
+      <w:pPr>
+        <w:tabs>
+          <w:tab w:val="num" w:pos="5760"/>
+        </w:tabs>
+        <w:ind w:left="5760" w:hanging="360"/>
+      </w:pPr>
+    </w:lvl>
+    <w:lvl w:ilvl="8" w:tentative="1">
+      <w:start w:val="1"/>
+      <w:numFmt w:val="decimal"/>
+      <w:lvlText w:val="%9."/>
+      <w:lvlJc w:val="left"/>
+      <w:pPr>
+        <w:tabs>
+          <w:tab w:val="num" w:pos="6480"/>
+        </w:tabs>
+        <w:ind w:left="6480" w:hanging="360"/>
+      </w:pPr>
+    </w:lvl>
+  </w:abstractNum>
+  <w:abstractNum w:abstractNumId="2" w15:restartNumberingAfterBreak="0">
     <w:nsid w:val="51ED2FC4"/>
     <w:multiLevelType w:val="hybridMultilevel"/>
     <w:tmpl w:val="A4DC2738"/>
@@ -1421,7 +1799,7 @@
       </w:pPr>
     </w:lvl>
   </w:abstractNum>
-  <w:abstractNum w:abstractNumId="2" w15:restartNumberingAfterBreak="0">
+  <w:abstractNum w:abstractNumId="3" w15:restartNumberingAfterBreak="0">
     <w:nsid w:val="52EB46AA"/>
     <w:multiLevelType w:val="multilevel"/>
     <w:tmpl w:val="42F4F608"/>
@@ -1570,7 +1948,7 @@
       </w:rPr>
     </w:lvl>
   </w:abstractNum>
-  <w:abstractNum w:abstractNumId="3" w15:restartNumberingAfterBreak="0">
+  <w:abstractNum w:abstractNumId="4" w15:restartNumberingAfterBreak="0">
     <w:nsid w:val="6B933359"/>
     <w:multiLevelType w:val="hybridMultilevel"/>
     <w:tmpl w:val="434083D6"/>
@@ -1684,16 +2062,19 @@
     </w:lvl>
   </w:abstractNum>
   <w:num w:numId="1" w16cid:durableId="2032753311">
-    <w:abstractNumId w:val="1"/>
+    <w:abstractNumId w:val="2"/>
   </w:num>
   <w:num w:numId="2" w16cid:durableId="434716932">
-    <w:abstractNumId w:val="3"/>
+    <w:abstractNumId w:val="4"/>
   </w:num>
   <w:num w:numId="3" w16cid:durableId="245772128">
-    <w:abstractNumId w:val="2"/>
+    <w:abstractNumId w:val="3"/>
   </w:num>
   <w:num w:numId="4" w16cid:durableId="654335722">
     <w:abstractNumId w:val="0"/>
+  </w:num>
+  <w:num w:numId="5" w16cid:durableId="2069181396">
+    <w:abstractNumId w:val="1"/>
   </w:num>
 </w:numbering>
 </file>

</xml_diff>